<commit_message>
Add CPP102 Weeks 9-14 modules, Midterm files, templates, and .gitignore
Includes Week 14 module and its condensed Revision 1, Weeks 9-13 modules,
Midterm examination materials, exam templates, and updated OBTLP files.

Co-Authored-By: Claude Opus 5.5 <noreply@anthropic.com>
Claude-Session: https://claude.ai/code/session_01YbCQ67Qcjfc83P7ySF648P
</commit_message>
<xml_diff>
--- a/CPP102-Programming-Logic-and-Design/OBTLP/CPP102-OBTLP-Revision-Summary-and-Compliance-Matrix-2026.docx
+++ b/CPP102-Programming-Logic-and-Design/OBTLP/CPP102-OBTLP-Revision-Summary-and-Compliance-Matrix-2026.docx
@@ -439,14 +439,8 @@
               <w:spacing w:after="20" w:before="20"/>
               <w:jc w:val="left"/>
             </w:pPr>
-            <w:r/>
             <w:r>
-              <w:rPr>
-                <w:rFonts w:ascii="Century Gothic" w:hAnsi="Century Gothic"/>
-                <w:b w:val="0"/>
-                <w:sz w:val="18"/>
-              </w:rPr>
-              <w:t>Allocated three progressive weeks: Functions Fundamentals (Week 8), Function Behavior and Data Flow (Week 9), and Modular Programming and Function Integration (Week 10).</w:t>
+              <w:t>Allocated three progressive weeks: Functions Fundamentals (Week 9), Function Behavior and Data Flow (Week 10), and Modular Programming and Function Integration (Week 11).</w:t>
             </w:r>
           </w:p>
         </w:tc>
@@ -935,14 +929,8 @@
               <w:spacing w:after="20" w:before="20"/>
               <w:jc w:val="left"/>
             </w:pPr>
-            <w:r/>
             <w:r>
-              <w:rPr>
-                <w:rFonts w:ascii="Century Gothic" w:hAnsi="Century Gothic"/>
-                <w:b w:val="0"/>
-                <w:sz w:val="18"/>
-              </w:rPr>
-              <w:t>Added Week 11, "Lists and Array Concepts," distinguishing Python lists from traditional arrays, with indexing, slicing, traversal, adding/updating/deleting, and aggregation.</w:t>
+              <w:t>Added "Lists and Array Concepts" as Week 13, distinguishing Python lists from traditional arrays and from strings, and placing it after the Midterm Examination so that it is taught with adequate time rather than compressed before the examination.</w:t>
             </w:r>
           </w:p>
         </w:tc>
@@ -1121,14 +1109,8 @@
               <w:spacing w:after="20" w:before="20"/>
               <w:jc w:val="left"/>
             </w:pPr>
-            <w:r/>
             <w:r>
-              <w:rPr>
-                <w:rFonts w:ascii="Century Gothic" w:hAnsi="Century Gothic"/>
-                <w:b w:val="0"/>
-                <w:sz w:val="18"/>
-              </w:rPr>
-              <w:t>Added Week 13: program tracing, dry-run analysis, test-case design, input validation, defensive programming, introductory computer-memory concepts, and formatted output.</w:t>
+              <w:t>Distributed program tracing, dry-run analysis, test-case design, input validation, and debugging across Weeks 13 and 14 as embedded teaching and learning activities and assessment evidence, rather than isolating them in a single week.</w:t>
             </w:r>
           </w:p>
         </w:tc>
@@ -1335,6 +1317,50 @@
                 <w:sz w:val="18"/>
               </w:rPr>
               <w:t>Constructive Alignment Improvement</w:t>
+            </w:r>
+          </w:p>
+        </w:tc>
+      </w:tr>
+      <w:tr>
+        <w:tc>
+          <w:tcPr>
+            <w:tcW w:type="dxa" w:w="5616"/>
+          </w:tcPr>
+          <w:p>
+            <w:pPr>
+              <w:spacing w:after="20" w:before="20"/>
+              <w:jc w:val="left"/>
+            </w:pPr>
+            <w:r>
+              <w:t>Iteration was compressed into a single week that combined fundamental loops with nested loops, and Functions Fundamentals followed immediately in Week 8. The pacing was too fast for introductory students.</w:t>
+            </w:r>
+          </w:p>
+        </w:tc>
+        <w:tc>
+          <w:tcPr>
+            <w:tcW w:type="dxa" w:w="7488"/>
+          </w:tcPr>
+          <w:p>
+            <w:pPr>
+              <w:spacing w:after="20" w:before="20"/>
+              <w:jc w:val="left"/>
+            </w:pPr>
+            <w:r>
+              <w:t>Split iteration across two weeks: Week 7 now covers fundamental, single-level iteration and loop-control structures only, and Week 8 devotes the full session to nested loops and multi-level iteration. Functions Fundamentals moved to Week 9, Function Behavior to Week 10, and Modular Programming to Week 11. Lists and Array Concepts moved to Week 13, after the Midterm Examination.</w:t>
+            </w:r>
+          </w:p>
+        </w:tc>
+        <w:tc>
+          <w:tcPr>
+            <w:tcW w:type="dxa" w:w="3600"/>
+          </w:tcPr>
+          <w:p>
+            <w:pPr>
+              <w:spacing w:after="20" w:before="20"/>
+              <w:jc w:val="left"/>
+            </w:pPr>
+            <w:r>
+              <w:t>Instructional Pacing Improvement</w:t>
             </w:r>
           </w:p>
         </w:tc>
@@ -2419,14 +2445,8 @@
               <w:spacing w:after="20" w:before="20"/>
               <w:jc w:val="center"/>
             </w:pPr>
-            <w:r/>
             <w:r>
-              <w:rPr>
-                <w:rFonts w:ascii="Century Gothic" w:hAnsi="Century Gothic"/>
-                <w:b w:val="0"/>
-                <w:sz w:val="18"/>
-              </w:rPr>
-              <w:t>4, 11</w:t>
+              <w:t>4, 13</w:t>
             </w:r>
           </w:p>
         </w:tc>
@@ -2439,14 +2459,8 @@
               <w:spacing w:after="20" w:before="20"/>
               <w:jc w:val="left"/>
             </w:pPr>
-            <w:r/>
             <w:r>
-              <w:rPr>
-                <w:rFonts w:ascii="Century Gothic" w:hAnsi="Century Gothic"/>
-                <w:b w:val="0"/>
-                <w:sz w:val="18"/>
-              </w:rPr>
-              <w:t>Lab 4, 10</w:t>
+              <w:t>Lab 4, 11</w:t>
             </w:r>
           </w:p>
         </w:tc>
@@ -2809,14 +2823,8 @@
               <w:spacing w:after="20" w:before="20"/>
               <w:jc w:val="left"/>
             </w:pPr>
-            <w:r/>
             <w:r>
-              <w:rPr>
-                <w:rFonts w:ascii="Century Gothic" w:hAnsi="Century Gothic"/>
-                <w:b w:val="0"/>
-                <w:sz w:val="18"/>
-              </w:rPr>
-              <w:t>Iteration (while, do-while concept/Python equivalent, for, nested, break, continue)</w:t>
+              <w:t>Iteration: while, do-while concept and its Python equivalent, for, range(), counters, accumulators, break, continue, sentinel-controlled repetition, and input validation (single-level)</w:t>
             </w:r>
           </w:p>
         </w:tc>
@@ -2829,13 +2837,7 @@
               <w:spacing w:after="20" w:before="20"/>
               <w:jc w:val="center"/>
             </w:pPr>
-            <w:r/>
             <w:r>
-              <w:rPr>
-                <w:rFonts w:ascii="Century Gothic" w:hAnsi="Century Gothic"/>
-                <w:b w:val="0"/>
-                <w:sz w:val="18"/>
-              </w:rPr>
               <w:t>7</w:t>
             </w:r>
           </w:p>
@@ -2849,13 +2851,7 @@
               <w:spacing w:after="20" w:before="20"/>
               <w:jc w:val="left"/>
             </w:pPr>
-            <w:r/>
             <w:r>
-              <w:rPr>
-                <w:rFonts w:ascii="Century Gothic" w:hAnsi="Century Gothic"/>
-                <w:b w:val="0"/>
-                <w:sz w:val="18"/>
-              </w:rPr>
               <w:t>Lab 6</w:t>
             </w:r>
           </w:p>
@@ -2869,14 +2865,66 @@
               <w:spacing w:after="20" w:before="20"/>
               <w:jc w:val="left"/>
             </w:pPr>
-            <w:r/>
             <w:r>
-              <w:rPr>
-                <w:rFonts w:ascii="Century Gothic" w:hAnsi="Century Gothic"/>
-                <w:b w:val="0"/>
-                <w:sz w:val="18"/>
-              </w:rPr>
-              <w:t>Looping machine problem</w:t>
+              <w:t>Fundamental iteration machine problem; loop trace tables</w:t>
+            </w:r>
+          </w:p>
+        </w:tc>
+      </w:tr>
+      <w:tr>
+        <w:tc>
+          <w:tcPr>
+            <w:tcW w:type="dxa" w:w="5760"/>
+          </w:tcPr>
+          <w:p>
+            <w:pPr>
+              <w:spacing w:after="20" w:before="20"/>
+              <w:jc w:val="left"/>
+            </w:pPr>
+            <w:r>
+              <w:t>Nested loops and multi-level iteration: outer and inner loops, execution order, row-and-column processing, table and coordinate generation, and nested-loop debugging</w:t>
+            </w:r>
+          </w:p>
+        </w:tc>
+        <w:tc>
+          <w:tcPr>
+            <w:tcW w:type="dxa" w:w="1584"/>
+          </w:tcPr>
+          <w:p>
+            <w:pPr>
+              <w:spacing w:after="20" w:before="20"/>
+              <w:jc w:val="center"/>
+            </w:pPr>
+            <w:r>
+              <w:t>8</w:t>
+            </w:r>
+          </w:p>
+        </w:tc>
+        <w:tc>
+          <w:tcPr>
+            <w:tcW w:type="dxa" w:w="3744"/>
+          </w:tcPr>
+          <w:p>
+            <w:pPr>
+              <w:spacing w:after="20" w:before="20"/>
+              <w:jc w:val="left"/>
+            </w:pPr>
+            <w:r>
+              <w:t>Lab 7</w:t>
+            </w:r>
+          </w:p>
+        </w:tc>
+        <w:tc>
+          <w:tcPr>
+            <w:tcW w:type="dxa" w:w="5616"/>
+          </w:tcPr>
+          <w:p>
+            <w:pPr>
+              <w:spacing w:after="20" w:before="20"/>
+              <w:jc w:val="left"/>
+            </w:pPr>
+            <w:r>
+              <w:t>Nested-loop machine problem; execution-count and trace-table items</w:t>
             </w:r>
           </w:p>
         </w:tc>
@@ -2911,14 +2959,8 @@
               <w:spacing w:after="20" w:before="20"/>
               <w:jc w:val="center"/>
             </w:pPr>
-            <w:r/>
             <w:r>
-              <w:rPr>
-                <w:rFonts w:ascii="Century Gothic" w:hAnsi="Century Gothic"/>
-                <w:b w:val="0"/>
-                <w:sz w:val="18"/>
-              </w:rPr>
-              <w:t>8, 9</w:t>
+              <w:t>9, 10</w:t>
             </w:r>
           </w:p>
         </w:tc>
@@ -2931,14 +2973,8 @@
               <w:spacing w:after="20" w:before="20"/>
               <w:jc w:val="left"/>
             </w:pPr>
-            <w:r/>
             <w:r>
-              <w:rPr>
-                <w:rFonts w:ascii="Century Gothic" w:hAnsi="Century Gothic"/>
-                <w:b w:val="0"/>
-                <w:sz w:val="18"/>
-              </w:rPr>
-              <w:t>Lab 7, 8</w:t>
+              <w:t>Lab 8, 9</w:t>
             </w:r>
           </w:p>
         </w:tc>
@@ -2993,14 +3029,8 @@
               <w:spacing w:after="20" w:before="20"/>
               <w:jc w:val="center"/>
             </w:pPr>
-            <w:r/>
             <w:r>
-              <w:rPr>
-                <w:rFonts w:ascii="Century Gothic" w:hAnsi="Century Gothic"/>
-                <w:b w:val="0"/>
-                <w:sz w:val="18"/>
-              </w:rPr>
-              <w:t>10</w:t>
+              <w:t>11</w:t>
             </w:r>
           </w:p>
         </w:tc>
@@ -3013,14 +3043,8 @@
               <w:spacing w:after="20" w:before="20"/>
               <w:jc w:val="left"/>
             </w:pPr>
-            <w:r/>
             <w:r>
-              <w:rPr>
-                <w:rFonts w:ascii="Century Gothic" w:hAnsi="Century Gothic"/>
-                <w:b w:val="0"/>
-                <w:sz w:val="18"/>
-              </w:rPr>
-              <w:t>Lab 9</w:t>
+              <w:t>Lab 10</w:t>
             </w:r>
           </w:p>
         </w:tc>
@@ -3075,14 +3099,8 @@
               <w:spacing w:after="20" w:before="20"/>
               <w:jc w:val="center"/>
             </w:pPr>
-            <w:r/>
             <w:r>
-              <w:rPr>
-                <w:rFonts w:ascii="Century Gothic" w:hAnsi="Century Gothic"/>
-                <w:b w:val="0"/>
-                <w:sz w:val="18"/>
-              </w:rPr>
-              <w:t>11</w:t>
+              <w:t>13</w:t>
             </w:r>
           </w:p>
         </w:tc>
@@ -3095,14 +3113,8 @@
               <w:spacing w:after="20" w:before="20"/>
               <w:jc w:val="left"/>
             </w:pPr>
-            <w:r/>
             <w:r>
-              <w:rPr>
-                <w:rFonts w:ascii="Century Gothic" w:hAnsi="Century Gothic"/>
-                <w:b w:val="0"/>
-                <w:sz w:val="18"/>
-              </w:rPr>
-              <w:t>Lab 10</w:t>
+              <w:t>Lab 11</w:t>
             </w:r>
           </w:p>
         </w:tc>
@@ -3115,14 +3127,8 @@
               <w:spacing w:after="20" w:before="20"/>
               <w:jc w:val="left"/>
             </w:pPr>
-            <w:r/>
             <w:r>
-              <w:rPr>
-                <w:rFonts w:ascii="Century Gothic" w:hAnsi="Century Gothic"/>
-                <w:b w:val="0"/>
-                <w:sz w:val="18"/>
-              </w:rPr>
-              <w:t>List-processing program; midterm examination</w:t>
+              <w:t>List-processing program; final examination</w:t>
             </w:r>
           </w:p>
         </w:tc>
@@ -3157,14 +3163,8 @@
               <w:spacing w:after="20" w:before="20"/>
               <w:jc w:val="center"/>
             </w:pPr>
-            <w:r/>
             <w:r>
-              <w:rPr>
-                <w:rFonts w:ascii="Century Gothic" w:hAnsi="Century Gothic"/>
-                <w:b w:val="0"/>
-                <w:sz w:val="18"/>
-              </w:rPr>
-              <w:t>13</w:t>
+              <w:t>13, 14</w:t>
             </w:r>
           </w:p>
         </w:tc>
@@ -3177,14 +3177,8 @@
               <w:spacing w:after="20" w:before="20"/>
               <w:jc w:val="left"/>
             </w:pPr>
-            <w:r/>
             <w:r>
-              <w:rPr>
-                <w:rFonts w:ascii="Century Gothic" w:hAnsi="Century Gothic"/>
-                <w:b w:val="0"/>
-                <w:sz w:val="18"/>
-              </w:rPr>
-              <w:t>Lab 11</w:t>
+              <w:t>Lab 11, 12</w:t>
             </w:r>
           </w:p>
         </w:tc>
@@ -3239,14 +3233,8 @@
               <w:spacing w:after="20" w:before="20"/>
               <w:jc w:val="center"/>
             </w:pPr>
-            <w:r/>
             <w:r>
-              <w:rPr>
-                <w:rFonts w:ascii="Century Gothic" w:hAnsi="Century Gothic"/>
-                <w:b w:val="0"/>
-                <w:sz w:val="18"/>
-              </w:rPr>
-              <w:t>13</w:t>
+              <w:t>13, 14</w:t>
             </w:r>
           </w:p>
         </w:tc>
@@ -3259,14 +3247,8 @@
               <w:spacing w:after="20" w:before="20"/>
               <w:jc w:val="left"/>
             </w:pPr>
-            <w:r/>
             <w:r>
-              <w:rPr>
-                <w:rFonts w:ascii="Century Gothic" w:hAnsi="Century Gothic"/>
-                <w:b w:val="0"/>
-                <w:sz w:val="18"/>
-              </w:rPr>
-              <w:t>Lab 11</w:t>
+              <w:t>Lab 11, 12</w:t>
             </w:r>
           </w:p>
         </w:tc>
@@ -3321,14 +3303,8 @@
               <w:spacing w:after="20" w:before="20"/>
               <w:jc w:val="center"/>
             </w:pPr>
-            <w:r/>
             <w:r>
-              <w:rPr>
-                <w:rFonts w:ascii="Century Gothic" w:hAnsi="Century Gothic"/>
-                <w:b w:val="0"/>
-                <w:sz w:val="18"/>
-              </w:rPr>
-              <w:t>13</w:t>
+              <w:t>13, 14</w:t>
             </w:r>
           </w:p>
         </w:tc>
@@ -3341,14 +3317,8 @@
               <w:spacing w:after="20" w:before="20"/>
               <w:jc w:val="left"/>
             </w:pPr>
-            <w:r/>
             <w:r>
-              <w:rPr>
-                <w:rFonts w:ascii="Century Gothic" w:hAnsi="Century Gothic"/>
-                <w:b w:val="0"/>
-                <w:sz w:val="18"/>
-              </w:rPr>
-              <w:t>Lab 11</w:t>
+              <w:t>Lab 11, 12</w:t>
             </w:r>
           </w:p>
         </w:tc>
@@ -3403,14 +3373,8 @@
               <w:spacing w:after="20" w:before="20"/>
               <w:jc w:val="center"/>
             </w:pPr>
-            <w:r/>
             <w:r>
-              <w:rPr>
-                <w:rFonts w:ascii="Century Gothic" w:hAnsi="Century Gothic"/>
-                <w:b w:val="0"/>
-                <w:sz w:val="18"/>
-              </w:rPr>
-              <w:t>13</w:t>
+              <w:t>7, 13, 14</w:t>
             </w:r>
           </w:p>
         </w:tc>
@@ -3423,14 +3387,8 @@
               <w:spacing w:after="20" w:before="20"/>
               <w:jc w:val="left"/>
             </w:pPr>
-            <w:r/>
             <w:r>
-              <w:rPr>
-                <w:rFonts w:ascii="Century Gothic" w:hAnsi="Century Gothic"/>
-                <w:b w:val="0"/>
-                <w:sz w:val="18"/>
-              </w:rPr>
-              <w:t>Lab 11</w:t>
+              <w:t>Lab 6, 11, 12</w:t>
             </w:r>
           </w:p>
         </w:tc>
@@ -3485,13 +3443,7 @@
               <w:spacing w:after="20" w:before="20"/>
               <w:jc w:val="center"/>
             </w:pPr>
-            <w:r/>
             <w:r>
-              <w:rPr>
-                <w:rFonts w:ascii="Century Gothic" w:hAnsi="Century Gothic"/>
-                <w:b w:val="0"/>
-                <w:sz w:val="18"/>
-              </w:rPr>
               <w:t>13, 14</w:t>
             </w:r>
           </w:p>
@@ -3505,13 +3457,7 @@
               <w:spacing w:after="20" w:before="20"/>
               <w:jc w:val="left"/>
             </w:pPr>
-            <w:r/>
             <w:r>
-              <w:rPr>
-                <w:rFonts w:ascii="Century Gothic" w:hAnsi="Century Gothic"/>
-                <w:b w:val="0"/>
-                <w:sz w:val="18"/>
-              </w:rPr>
               <w:t>Lab 11, 12</w:t>
             </w:r>
           </w:p>
@@ -3567,13 +3513,7 @@
               <w:spacing w:after="20" w:before="20"/>
               <w:jc w:val="center"/>
             </w:pPr>
-            <w:r/>
             <w:r>
-              <w:rPr>
-                <w:rFonts w:ascii="Century Gothic" w:hAnsi="Century Gothic"/>
-                <w:b w:val="0"/>
-                <w:sz w:val="18"/>
-              </w:rPr>
               <w:t>13</w:t>
             </w:r>
           </w:p>
@@ -3587,13 +3527,7 @@
               <w:spacing w:after="20" w:before="20"/>
               <w:jc w:val="left"/>
             </w:pPr>
-            <w:r/>
             <w:r>
-              <w:rPr>
-                <w:rFonts w:ascii="Century Gothic" w:hAnsi="Century Gothic"/>
-                <w:b w:val="0"/>
-                <w:sz w:val="18"/>
-              </w:rPr>
               <w:t>Lab 11</w:t>
             </w:r>
           </w:p>
@@ -4187,6 +4121,64 @@
               <w:spacing w:after="20" w:before="20"/>
               <w:jc w:val="left"/>
             </w:pPr>
+            <w:r>
+              <w:t>Nested loops and row-column processing</w:t>
+            </w:r>
+          </w:p>
+        </w:tc>
+        <w:tc>
+          <w:tcPr>
+            <w:tcW w:type="dxa" w:w="4320"/>
+          </w:tcPr>
+          <w:p>
+            <w:pPr>
+              <w:spacing w:after="20" w:before="20"/>
+              <w:jc w:val="center"/>
+            </w:pPr>
+            <w:r>
+              <w:t>Computer Vision pixel-grid traversal, Robotics grid movement, repeated multi-sensor processing, and future multidimensional-data processing</w:t>
+            </w:r>
+          </w:p>
+        </w:tc>
+        <w:tc>
+          <w:tcPr>
+            <w:tcW w:type="dxa" w:w="1728"/>
+          </w:tcPr>
+          <w:p>
+            <w:pPr>
+              <w:spacing w:after="20" w:before="20"/>
+              <w:jc w:val="left"/>
+            </w:pPr>
+            <w:r>
+              <w:t>8</w:t>
+            </w:r>
+          </w:p>
+        </w:tc>
+        <w:tc>
+          <w:tcPr>
+            <w:tcW w:type="dxa" w:w="5760"/>
+          </w:tcPr>
+          <w:p>
+            <w:pPr>
+              <w:spacing w:after="20" w:before="20"/>
+              <w:jc w:val="left"/>
+            </w:pPr>
+            <w:r>
+              <w:t>Laboratory Exercise 7 — Nested Loops and Multi-Level Iteration</w:t>
+            </w:r>
+          </w:p>
+        </w:tc>
+      </w:tr>
+      <w:tr>
+        <w:tc>
+          <w:tcPr>
+            <w:tcW w:type="dxa" w:w="4896"/>
+          </w:tcPr>
+          <w:p>
+            <w:pPr>
+              <w:spacing w:after="20" w:before="20"/>
+              <w:jc w:val="left"/>
+            </w:pPr>
             <w:r/>
             <w:r>
               <w:rPr>
@@ -4227,13 +4219,7 @@
               <w:spacing w:after="20" w:before="20"/>
               <w:jc w:val="left"/>
             </w:pPr>
-            <w:r/>
             <w:r>
-              <w:rPr>
-                <w:rFonts w:ascii="Century Gothic" w:hAnsi="Century Gothic"/>
-                <w:b w:val="0"/>
-                <w:sz w:val="18"/>
-              </w:rPr>
               <w:t>14</w:t>
             </w:r>
           </w:p>
@@ -4247,13 +4233,7 @@
               <w:spacing w:after="20" w:before="20"/>
               <w:jc w:val="left"/>
             </w:pPr>
-            <w:r/>
             <w:r>
-              <w:rPr>
-                <w:rFonts w:ascii="Century Gothic" w:hAnsi="Century Gothic"/>
-                <w:b w:val="0"/>
-                <w:sz w:val="18"/>
-              </w:rPr>
               <w:t>Numerical-data processing program (Lab 12)</w:t>
             </w:r>
           </w:p>
@@ -4309,13 +4289,7 @@
               <w:spacing w:after="20" w:before="20"/>
               <w:jc w:val="left"/>
             </w:pPr>
-            <w:r/>
             <w:r>
-              <w:rPr>
-                <w:rFonts w:ascii="Century Gothic" w:hAnsi="Century Gothic"/>
-                <w:b w:val="0"/>
-                <w:sz w:val="18"/>
-              </w:rPr>
               <w:t>16</w:t>
             </w:r>
           </w:p>
@@ -4329,13 +4303,7 @@
               <w:spacing w:after="20" w:before="20"/>
               <w:jc w:val="left"/>
             </w:pPr>
-            <w:r/>
             <w:r>
-              <w:rPr>
-                <w:rFonts w:ascii="Century Gothic" w:hAnsi="Century Gothic"/>
-                <w:b w:val="0"/>
-                <w:sz w:val="18"/>
-              </w:rPr>
               <w:t>AI-track contextualized activity (Lab 14)</w:t>
             </w:r>
           </w:p>
@@ -4391,14 +4359,8 @@
               <w:spacing w:after="20" w:before="20"/>
               <w:jc w:val="left"/>
             </w:pPr>
-            <w:r/>
             <w:r>
-              <w:rPr>
-                <w:rFonts w:ascii="Century Gothic" w:hAnsi="Century Gothic"/>
-                <w:b w:val="0"/>
-                <w:sz w:val="18"/>
-              </w:rPr>
-              <w:t>11, 14, 16</w:t>
+              <w:t>13, 14, 16</w:t>
             </w:r>
           </w:p>
         </w:tc>
@@ -4411,14 +4373,8 @@
               <w:spacing w:after="20" w:before="20"/>
               <w:jc w:val="left"/>
             </w:pPr>
-            <w:r/>
             <w:r>
-              <w:rPr>
-                <w:rFonts w:ascii="Century Gothic" w:hAnsi="Century Gothic"/>
-                <w:b w:val="0"/>
-                <w:sz w:val="18"/>
-              </w:rPr>
-              <w:t>Sensor-data processing programs (Lab 10, 12, 14)</w:t>
+              <w:t>Sensor-data processing programs (Lab 11, 12, 14)</w:t>
             </w:r>
           </w:p>
         </w:tc>
@@ -4555,14 +4511,8 @@
               <w:spacing w:after="20" w:before="20"/>
               <w:jc w:val="left"/>
             </w:pPr>
-            <w:r/>
             <w:r>
-              <w:rPr>
-                <w:rFonts w:ascii="Century Gothic" w:hAnsi="Century Gothic"/>
-                <w:b w:val="0"/>
-                <w:sz w:val="18"/>
-              </w:rPr>
-              <w:t>10, 16</w:t>
+              <w:t>11, 16</w:t>
             </w:r>
           </w:p>
         </w:tc>
@@ -4575,14 +4525,8 @@
               <w:spacing w:after="20" w:before="20"/>
               <w:jc w:val="left"/>
             </w:pPr>
-            <w:r/>
             <w:r>
-              <w:rPr>
-                <w:rFonts w:ascii="Century Gothic" w:hAnsi="Century Gothic"/>
-                <w:b w:val="0"/>
-                <w:sz w:val="18"/>
-              </w:rPr>
-              <w:t>Integrated modular programs (Lab 9, 14)</w:t>
+              <w:t>Integrated modular programs (Lab 10, 14)</w:t>
             </w:r>
           </w:p>
         </w:tc>
@@ -4637,14 +4581,8 @@
               <w:spacing w:after="20" w:before="20"/>
               <w:jc w:val="left"/>
             </w:pPr>
-            <w:r/>
             <w:r>
-              <w:rPr>
-                <w:rFonts w:ascii="Century Gothic" w:hAnsi="Century Gothic"/>
-                <w:b w:val="0"/>
-                <w:sz w:val="18"/>
-              </w:rPr>
-              <w:t>13</w:t>
+              <w:t>13, 14</w:t>
             </w:r>
           </w:p>
         </w:tc>
@@ -4657,14 +4595,8 @@
               <w:spacing w:after="20" w:before="20"/>
               <w:jc w:val="left"/>
             </w:pPr>
-            <w:r/>
             <w:r>
-              <w:rPr>
-                <w:rFonts w:ascii="Century Gothic" w:hAnsi="Century Gothic"/>
-                <w:b w:val="0"/>
-                <w:sz w:val="18"/>
-              </w:rPr>
-              <w:t>Debugging and test-case exercise (Lab 11)</w:t>
+              <w:t>Debugging and test-case exercises (Lab 11, 12)</w:t>
             </w:r>
           </w:p>
         </w:tc>
@@ -4719,14 +4651,8 @@
               <w:spacing w:after="20" w:before="20"/>
               <w:jc w:val="left"/>
             </w:pPr>
-            <w:r/>
             <w:r>
-              <w:rPr>
-                <w:rFonts w:ascii="Century Gothic" w:hAnsi="Century Gothic"/>
-                <w:b w:val="0"/>
-                <w:sz w:val="18"/>
-              </w:rPr>
-              <w:t>13</w:t>
+              <w:t>7, 13, 14</w:t>
             </w:r>
           </w:p>
         </w:tc>
@@ -4739,14 +4665,8 @@
               <w:spacing w:after="20" w:before="20"/>
               <w:jc w:val="left"/>
             </w:pPr>
-            <w:r/>
             <w:r>
-              <w:rPr>
-                <w:rFonts w:ascii="Century Gothic" w:hAnsi="Century Gothic"/>
-                <w:b w:val="0"/>
-                <w:sz w:val="18"/>
-              </w:rPr>
-              <w:t>Validation within lab programs</w:t>
+              <w:t>Validation within lab programs (Lab 6, 11, 12)</w:t>
             </w:r>
           </w:p>
         </w:tc>
@@ -4843,14 +4763,8 @@
               <w:spacing w:after="20" w:before="20"/>
               <w:jc w:val="left"/>
             </w:pPr>
-            <w:r/>
             <w:r>
-              <w:rPr>
-                <w:rFonts w:ascii="Century Gothic" w:hAnsi="Century Gothic"/>
-                <w:b w:val="0"/>
-                <w:sz w:val="18"/>
-              </w:rPr>
-              <w:t>Basic algorithm evaluation (steps, clarity, appropriate loops and functions)</w:t>
+              <w:t>Basic algorithm evaluation (steps, clarity, appropriate loop choice, and comparison of alternative loop solutions)</w:t>
             </w:r>
           </w:p>
         </w:tc>
@@ -4883,14 +4797,8 @@
               <w:spacing w:after="20" w:before="20"/>
               <w:jc w:val="left"/>
             </w:pPr>
-            <w:r/>
             <w:r>
-              <w:rPr>
-                <w:rFonts w:ascii="Century Gothic" w:hAnsi="Century Gothic"/>
-                <w:b w:val="0"/>
-                <w:sz w:val="18"/>
-              </w:rPr>
-              <w:t>13, 15</w:t>
+              <w:t>8, 13, 15</w:t>
             </w:r>
           </w:p>
         </w:tc>
@@ -4903,14 +4811,8 @@
               <w:spacing w:after="20" w:before="20"/>
               <w:jc w:val="left"/>
             </w:pPr>
-            <w:r/>
             <w:r>
-              <w:rPr>
-                <w:rFonts w:ascii="Century Gothic" w:hAnsi="Century Gothic"/>
-                <w:b w:val="0"/>
-                <w:sz w:val="18"/>
-              </w:rPr>
-              <w:t>Peer code review; revised programs</w:t>
+              <w:t>Peer code review; revised programs (Lab 7, 11, 13)</w:t>
             </w:r>
           </w:p>
         </w:tc>

</xml_diff>